<commit_message>
ATA sprint D review
</commit_message>
<xml_diff>
--- a/.docs/grupo07-20261023.docx
+++ b/.docs/grupo07-20261023.docx
@@ -360,7 +360,7 @@
                 <w:szCs w:val="16.08060073852539"/>
                 <w:rtl w:val="0"/>
               </w:rPr>
-              <w:t xml:space="preserve">13:00 as 13:30</w:t>
+              <w:t xml:space="preserve">13:00 as 13:</w:t>
             </w:r>
           </w:p>
         </w:tc>
@@ -621,7 +621,7 @@
                 <w:szCs w:val="20"/>
                 <w:rtl w:val="0"/>
               </w:rPr>
-              <w:t xml:space="preserve">Daily Scrum</w:t>
+              <w:t xml:space="preserve">Sprint Review</w:t>
             </w:r>
           </w:p>
         </w:tc>
@@ -4008,8 +4008,8 @@
           <w:i w:val="1"/>
           <w:iCs w:val="1"/>
           <w:color w:val="707070"/>
-          <w:sz w:val="16.081501007080078"/>
-          <w:szCs w:val="16.081501007080078"/>
+          <w:sz w:val="18.081501007080078"/>
+          <w:szCs w:val="18.081501007080078"/>
         </w:rPr>
       </w:pPr>
       <w:r>
@@ -4031,7 +4031,25 @@
           <w:szCs w:val="14"/>
           <w:rtl w:val="0"/>
         </w:rPr>
-        <w:t xml:space="preserve">   </w:t>
+        <w:t xml:space="preserve">  </w:t>
+      </w:r>
+      <w:r>
+        <w:rPr>
+          <w:color w:val="707070"/>
+          <w:sz w:val="14"/>
+          <w:szCs w:val="14"/>
+          <w:rtl w:val="0"/>
+        </w:rPr>
+        <w:t xml:space="preserve"> </w:t>
+      </w:r>
+      <w:r>
+        <w:rPr>
+          <w:color w:val="707070"/>
+          <w:sz w:val="16"/>
+          <w:szCs w:val="16"/>
+          <w:rtl w:val="0"/>
+        </w:rPr>
+        <w:t xml:space="preserve">Expectativas do cliente altas para a finalização do projeto</w:t>
       </w:r>
       <w:r>
         <w:rPr>

</xml_diff>